<commit_message>
Replace Annex with a link to this repository, per the editorial committee's decision
Gilbert reported back after the 2 October committee meeting: no separate
annex, just a link to this GitHub repository; references listed at the
end (not footnotes); AI disclosure is fine as written.

- chronique.qmd: four "Annex 1" references now point to this repo (one
  as a new footnote introducing the link, three as short references).
- Annex.qmd: comment block updated to record that it's no longer
  submitted to the journal, just kept here as documentation.
- README.md: same clarification.
</commit_message>
<xml_diff>
--- a/chronique_bibliography.docx
+++ b/chronique_bibliography.docx
@@ -253,7 +253,7 @@
       </w:r>
     </w:p>
     <w:bookmarkEnd w:id="18"/>
-    <w:bookmarkStart w:id="22" w:name="migneret-and-his-pamphlet"/>
+    <w:bookmarkStart w:id="24" w:name="migneret-and-his-pamphlet"/>
     <w:p>
       <w:pPr>
         <w:pStyle w:val="Heading1"/>
@@ -515,11 +515,23 @@
         <w:t xml:space="preserve">Oracle(question)</w:t>
       </w:r>
       <w:r>
-        <w:t xml:space="preserve">, if time travel had been available to him. In Annex 1, I have done it for him. But there is more to Migneret’s bravado. Buried in the preface is a quiet boast: the best mathematicians of his day would perhaps have declared it impossible to produce Latin verses by arithmetic alone. He pulled it off anyway.</w:t>
-      </w:r>
-    </w:p>
-    <w:bookmarkEnd w:id="22"/>
-    <w:bookmarkStart w:id="32" w:name="the-oracle-at-work"/>
+        <w:t xml:space="preserve">, if time travel had been available to him. I have done it for him, in a program kept in a public repository.</w:t>
+      </w:r>
+      <w:r>
+        <w:rPr>
+          <w:rStyle w:val="FootnoteReference"/>
+        </w:rPr>
+        <w:footnoteReference w:id="22"/>
+      </w:r>
+      <w:r>
+        <w:t xml:space="preserve"> </w:t>
+      </w:r>
+      <w:r>
+        <w:t xml:space="preserve">But there is more to Migneret’s bravado. Buried in the preface is a quiet boast: the best mathematicians of his day would perhaps have declared it impossible to produce Latin verses by arithmetic alone. He pulled it off anyway.</w:t>
+      </w:r>
+    </w:p>
+    <w:bookmarkEnd w:id="24"/>
+    <w:bookmarkStart w:id="34" w:name="the-oracle-at-work"/>
     <w:p>
       <w:pPr>
         <w:pStyle w:val="Heading1"/>
@@ -741,10 +753,10 @@
         <w:rPr>
           <w:rStyle w:val="FootnoteReference"/>
         </w:rPr>
-        <w:footnoteReference w:id="23"/>
-      </w:r>
-    </w:p>
-    <w:bookmarkStart w:id="31" w:name="how-the-machine-works"/>
+        <w:footnoteReference w:id="25"/>
+      </w:r>
+    </w:p>
+    <w:bookmarkStart w:id="33" w:name="how-the-machine-works"/>
     <w:p>
       <w:pPr>
         <w:pStyle w:val="Heading2"/>
@@ -921,7 +933,7 @@
         <w:rPr>
           <w:rStyle w:val="FootnoteReference"/>
         </w:rPr>
-        <w:footnoteReference w:id="24"/>
+        <w:footnoteReference w:id="26"/>
       </w:r>
       <w:r>
         <w:t xml:space="preserve"> </w:t>
@@ -1261,18 +1273,18 @@
           <wp:inline>
             <wp:extent cx="2519999" cy="3893647"/>
             <wp:effectExtent b="0" l="0" r="0" t="0"/>
-            <wp:docPr descr="" title="" id="26" name="Picture"/>
+            <wp:docPr descr="" title="" id="28" name="Picture"/>
             <a:graphic>
               <a:graphicData uri="http://schemas.openxmlformats.org/drawingml/2006/picture">
                 <pic:pic>
                   <pic:nvPicPr>
-                    <pic:cNvPr descr="images/Migneret-p53.png" id="27" name="Picture"/>
+                    <pic:cNvPr descr="images/Migneret-p53.png" id="29" name="Picture"/>
                     <pic:cNvPicPr>
                       <a:picLocks noChangeArrowheads="1" noChangeAspect="1"/>
                     </pic:cNvPicPr>
                   </pic:nvPicPr>
                   <pic:blipFill>
-                    <a:blip r:embed="rId25"/>
+                    <a:blip r:embed="rId27"/>
                     <a:stretch>
                       <a:fillRect/>
                     </a:stretch>
@@ -1330,7 +1342,7 @@
         <w:t xml:space="preserve"> </w:t>
       </w:r>
       <w:r>
-        <w:t xml:space="preserve">The right-hand edge of the triangle, read upward from its tip, begins with six digits, one for each word of the hexameter, each between 1 and 9. For our question they are 3, 9, 3, 6, 2, 3. Each is the number of a horizontal band, common to the two tables of Step 6 (Figure 3). Migneret dresses this up: he lays the triangle out in a grid of six lines and seven columns, then multiplies, adds and reduces modulo 9 once more to turn every other digit into a number between 11 and 72 (pp. 33–43), the numbers printed in the first table. Implementing the procedure in R shows that this changes nothing: the six indicators alone decide the verse (the program is in Annex 1).</w:t>
+        <w:t xml:space="preserve">The right-hand edge of the triangle, read upward from its tip, begins with six digits, one for each word of the hexameter, each between 1 and 9. For our question they are 3, 9, 3, 6, 2, 3. Each is the number of a horizontal band, common to the two tables of Step 6 (Figure 3). Migneret dresses this up: he lays the triangle out in a grid of six lines and seven columns, then multiplies, adds and reduces modulo 9 once more to turn every other digit into a number between 11 and 72 (pp. 33–43), the numbers printed in the first table. Implementing the procedure in R shows that this changes nothing: the six indicators alone decide the verse (the program is in the GitHub repository).</w:t>
       </w:r>
     </w:p>
     <w:p>
@@ -1460,18 +1472,18 @@
           <wp:inline>
             <wp:extent cx="4679999" cy="3325386"/>
             <wp:effectExtent b="0" l="0" r="0" t="0"/>
-            <wp:docPr descr="" title="" id="29" name="Picture"/>
+            <wp:docPr descr="" title="" id="31" name="Picture"/>
             <a:graphic>
               <a:graphicData uri="http://schemas.openxmlformats.org/drawingml/2006/picture">
                 <pic:pic>
                   <pic:nvPicPr>
-                    <pic:cNvPr descr="images/Migneret-p63.png" id="30" name="Picture"/>
+                    <pic:cNvPr descr="images/Migneret-p63.png" id="32" name="Picture"/>
                     <pic:cNvPicPr>
                       <a:picLocks noChangeArrowheads="1" noChangeAspect="1"/>
                     </pic:cNvPicPr>
                   </pic:nvPicPr>
                   <pic:blipFill>
-                    <a:blip r:embed="rId28"/>
+                    <a:blip r:embed="rId30"/>
                     <a:stretch>
                       <a:fillRect/>
                     </a:stretch>
@@ -2982,7 +2994,7 @@
         <w:t xml:space="preserve"> </w:t>
       </w:r>
       <w:r>
-        <w:t xml:space="preserve">from the tables of the pamphlet (Migneret, 1759, plate between pp. 54 and 55); the full derivation is in Annex 1.</w:t>
+        <w:t xml:space="preserve">from the tables of the pamphlet (Migneret, 1759, plate between pp. 54 and 55); the full derivation is in the GitHub repository.</w:t>
       </w:r>
     </w:p>
     <w:p>
@@ -3055,9 +3067,9 @@
         <w:t xml:space="preserve">their computer screen.</w:t>
       </w:r>
     </w:p>
-    <w:bookmarkEnd w:id="31"/>
-    <w:bookmarkEnd w:id="32"/>
-    <w:bookmarkStart w:id="33" w:name="the-parallel-with-large-language-models"/>
+    <w:bookmarkEnd w:id="33"/>
+    <w:bookmarkEnd w:id="34"/>
+    <w:bookmarkStart w:id="35" w:name="the-parallel-with-large-language-models"/>
     <w:p>
       <w:pPr>
         <w:pStyle w:val="Heading1"/>
@@ -3473,8 +3485,8 @@
         <w:t xml:space="preserve">, the tokenization scheme used by GPT-2 and its successors, which also stores a vocabulary of characters and common letter sequences and assembles output by concatenating them; the resemblance is structural rather than mechanistic, since Migneret’s digrams were hand-picked for euphony and meter, while BPE’s are induced automatically from corpus statistics. Migneret compiled his table by hand. An LLM’s was assembled by training on essentially all of human writing. The scale differs by nine or ten orders of magnitude. The architecture does not.</w:t>
       </w:r>
     </w:p>
-    <w:bookmarkEnd w:id="33"/>
-    <w:bookmarkStart w:id="35" w:name="then-and-now"/>
+    <w:bookmarkEnd w:id="35"/>
+    <w:bookmarkStart w:id="37" w:name="then-and-now"/>
     <w:p>
       <w:pPr>
         <w:pStyle w:val="Heading1"/>
@@ -3502,7 +3514,7 @@
         <w:rPr>
           <w:rStyle w:val="FootnoteReference"/>
         </w:rPr>
-        <w:footnoteReference w:id="34"/>
+        <w:footnoteReference w:id="36"/>
       </w:r>
     </w:p>
     <w:p>
@@ -3612,8 +3624,8 @@
         <w:t xml:space="preserve">What his machine does raise is the prior question: is the category of trick sufficient? Migneret thought it was enough to debunk oracles, and he was right. Whether the same trick, scaled by nine orders of magnitude, is enough to debunk ChatGPT is something Antoine left as an exercise for the reader.</w:t>
       </w:r>
     </w:p>
-    <w:bookmarkEnd w:id="35"/>
-    <w:bookmarkStart w:id="37" w:name="coding-the-oracle"/>
+    <w:bookmarkEnd w:id="37"/>
+    <w:bookmarkStart w:id="39" w:name="coding-the-oracle"/>
     <w:p>
       <w:pPr>
         <w:pStyle w:val="Heading1"/>
@@ -3627,7 +3639,7 @@
         <w:pStyle w:val="FirstParagraph"/>
       </w:pPr>
       <w:r>
-        <w:t xml:space="preserve">To be sure I had understood the pamphlet, I wanted to see if I could make Migneret’s machine actually run and produce his output from the Oracle. I did so with the help of an AI assistant (Claude Sonnet 5, from Anthropic, used through its Claude Code tool in September 2026), and it is worth saying how, because it is another angle on this topic. My AI assistant read the scan of the pamphlet and Migneret’s own instructions, and we turned them together into an R program (Annex 1), tested against the worked examples he prints. In a slightly self-referential way, Claude served as my Oracle in this.</w:t>
+        <w:t xml:space="preserve">To be sure I had understood the pamphlet, I wanted to see if I could make Migneret’s machine actually run and produce his output from the Oracle. I did so with the help of an AI assistant (Claude Sonnet 5, from Anthropic, used through its Claude Code tool in September 2026), and it is worth saying how, because it is another angle on this topic. My AI assistant read the scan of the pamphlet and Migneret’s own instructions, and we turned them together into an R program (in the GitHub repository), tested against the worked examples he prints. In a slightly self-referential way, Claude served as my Oracle in this.</w:t>
       </w:r>
     </w:p>
     <w:p>
@@ -3718,11 +3730,11 @@
         <w:rPr>
           <w:rStyle w:val="FootnoteReference"/>
         </w:rPr>
-        <w:footnoteReference w:id="36"/>
-      </w:r>
-    </w:p>
-    <w:bookmarkEnd w:id="37"/>
-    <w:bookmarkStart w:id="38" w:name="conclusion"/>
+        <w:footnoteReference w:id="38"/>
+      </w:r>
+    </w:p>
+    <w:bookmarkEnd w:id="39"/>
+    <w:bookmarkStart w:id="40" w:name="conclusion"/>
     <w:p>
       <w:pPr>
         <w:pStyle w:val="Heading1"/>
@@ -3763,8 +3775,8 @@
         <w:t xml:space="preserve">We are still listening, Antoine.</w:t>
       </w:r>
     </w:p>
-    <w:bookmarkEnd w:id="38"/>
-    <w:bookmarkStart w:id="64" w:name="bibliography"/>
+    <w:bookmarkEnd w:id="40"/>
+    <w:bookmarkStart w:id="66" w:name="bibliography"/>
     <w:p>
       <w:pPr>
         <w:pStyle w:val="Heading1"/>
@@ -3773,8 +3785,8 @@
         <w:t>Bibliography</w:t>
       </w:r>
     </w:p>
-    <w:bookmarkStart w:id="63" w:name="refs"/>
-    <w:bookmarkStart w:id="40" w:name="ref-ArmatteDroesbeke2023"/>
+    <w:bookmarkStart w:id="65" w:name="refs"/>
+    <w:bookmarkStart w:id="42" w:name="ref-ArmatteDroesbeke2023"/>
     <w:p>
       <w:pPr>
         <w:pStyle w:val="Bibliography"/>
@@ -3811,7 +3823,7 @@
       <w:r>
         <w:t xml:space="preserve"> </w:t>
       </w:r>
-      <w:hyperlink r:id="rId39">
+      <w:hyperlink r:id="rId41">
         <w:r>
           <w:rPr>
             <w:rStyle w:val="Hyperlink"/>
@@ -3820,8 +3832,8 @@
         </w:r>
       </w:hyperlink>
     </w:p>
-    <w:bookmarkEnd w:id="40"/>
-    <w:bookmarkStart w:id="42" w:name="ref-Tao2026Simons"/>
+    <w:bookmarkEnd w:id="42"/>
+    <w:bookmarkStart w:id="44" w:name="ref-Tao2026Simons"/>
     <w:p>
       <w:pPr>
         <w:pStyle w:val="Bibliography"/>
@@ -3845,7 +3857,7 @@
       <w:r>
         <w:t xml:space="preserve"> </w:t>
       </w:r>
-      <w:hyperlink r:id="rId41">
+      <w:hyperlink r:id="rId43">
         <w:r>
           <w:rPr>
             <w:rStyle w:val="Hyperlink"/>
@@ -3857,8 +3869,8 @@
         <w:t xml:space="preserve">, consulted on 22/09/2026.</w:t>
       </w:r>
     </w:p>
-    <w:bookmarkEnd w:id="42"/>
-    <w:bookmarkStart w:id="44" w:name="ref-Buehler2026"/>
+    <w:bookmarkEnd w:id="44"/>
+    <w:bookmarkStart w:id="46" w:name="ref-Buehler2026"/>
     <w:p>
       <w:pPr>
         <w:pStyle w:val="Bibliography"/>
@@ -3882,7 +3894,7 @@
       <w:r>
         <w:t xml:space="preserve"> </w:t>
       </w:r>
-      <w:hyperlink r:id="rId43">
+      <w:hyperlink r:id="rId45">
         <w:r>
           <w:rPr>
             <w:rStyle w:val="Hyperlink"/>
@@ -3891,8 +3903,8 @@
         </w:r>
       </w:hyperlink>
     </w:p>
-    <w:bookmarkEnd w:id="44"/>
-    <w:bookmarkStart w:id="46" w:name="ref-Fontenelle1687"/>
+    <w:bookmarkEnd w:id="46"/>
+    <w:bookmarkStart w:id="48" w:name="ref-Fontenelle1687"/>
     <w:p>
       <w:pPr>
         <w:pStyle w:val="Bibliography"/>
@@ -3916,7 +3928,7 @@
       <w:r>
         <w:t xml:space="preserve"> </w:t>
       </w:r>
-      <w:hyperlink r:id="rId45">
+      <w:hyperlink r:id="rId47">
         <w:r>
           <w:rPr>
             <w:rStyle w:val="Hyperlink"/>
@@ -3925,8 +3937,8 @@
         </w:r>
       </w:hyperlink>
     </w:p>
-    <w:bookmarkEnd w:id="46"/>
-    <w:bookmarkStart w:id="48" w:name="ref-Friendly2007"/>
+    <w:bookmarkEnd w:id="48"/>
+    <w:bookmarkStart w:id="50" w:name="ref-Friendly2007"/>
     <w:p>
       <w:pPr>
         <w:pStyle w:val="Bibliography"/>
@@ -3963,7 +3975,7 @@
       <w:r>
         <w:t xml:space="preserve"> </w:t>
       </w:r>
-      <w:hyperlink r:id="rId47">
+      <w:hyperlink r:id="rId49">
         <w:r>
           <w:rPr>
             <w:rStyle w:val="Hyperlink"/>
@@ -3972,8 +3984,8 @@
         </w:r>
       </w:hyperlink>
     </w:p>
-    <w:bookmarkEnd w:id="48"/>
-    <w:bookmarkStart w:id="50" w:name="ref-Friendly2008"/>
+    <w:bookmarkEnd w:id="50"/>
+    <w:bookmarkStart w:id="52" w:name="ref-Friendly2008"/>
     <w:p>
       <w:pPr>
         <w:pStyle w:val="Bibliography"/>
@@ -4010,7 +4022,7 @@
       <w:r>
         <w:t xml:space="preserve"> </w:t>
       </w:r>
-      <w:hyperlink r:id="rId49">
+      <w:hyperlink r:id="rId51">
         <w:r>
           <w:rPr>
             <w:rStyle w:val="Hyperlink"/>
@@ -4019,8 +4031,8 @@
         </w:r>
       </w:hyperlink>
     </w:p>
-    <w:bookmarkEnd w:id="50"/>
-    <w:bookmarkStart w:id="52" w:name="ref-Friendly2023"/>
+    <w:bookmarkEnd w:id="52"/>
+    <w:bookmarkStart w:id="54" w:name="ref-Friendly2023"/>
     <w:p>
       <w:pPr>
         <w:pStyle w:val="Bibliography"/>
@@ -4047,7 +4059,7 @@
       <w:r>
         <w:t xml:space="preserve"> </w:t>
       </w:r>
-      <w:hyperlink r:id="rId51">
+      <w:hyperlink r:id="rId53">
         <w:r>
           <w:rPr>
             <w:rStyle w:val="Hyperlink"/>
@@ -4056,8 +4068,8 @@
         </w:r>
       </w:hyperlink>
     </w:p>
-    <w:bookmarkEnd w:id="52"/>
-    <w:bookmarkStart w:id="54" w:name="ref-Friendly2020"/>
+    <w:bookmarkEnd w:id="54"/>
+    <w:bookmarkStart w:id="56" w:name="ref-Friendly2020"/>
     <w:p>
       <w:pPr>
         <w:pStyle w:val="Bibliography"/>
@@ -4084,7 +4096,7 @@
       <w:r>
         <w:t xml:space="preserve"> </w:t>
       </w:r>
-      <w:hyperlink r:id="rId53">
+      <w:hyperlink r:id="rId55">
         <w:r>
           <w:rPr>
             <w:rStyle w:val="Hyperlink"/>
@@ -4096,8 +4108,8 @@
         <w:t xml:space="preserve">, consulted on 20/09/2026.</w:t>
       </w:r>
     </w:p>
-    <w:bookmarkEnd w:id="54"/>
-    <w:bookmarkStart w:id="56" w:name="ref-Migneret1759"/>
+    <w:bookmarkEnd w:id="56"/>
+    <w:bookmarkStart w:id="58" w:name="ref-Migneret1759"/>
     <w:p>
       <w:pPr>
         <w:pStyle w:val="Bibliography"/>
@@ -4121,7 +4133,7 @@
       <w:r>
         <w:t xml:space="preserve"> </w:t>
       </w:r>
-      <w:hyperlink r:id="rId55">
+      <w:hyperlink r:id="rId57">
         <w:r>
           <w:rPr>
             <w:rStyle w:val="Hyperlink"/>
@@ -4130,8 +4142,8 @@
         </w:r>
       </w:hyperlink>
     </w:p>
-    <w:bookmarkEnd w:id="56"/>
-    <w:bookmarkStart w:id="58" w:name="ref-Sennrich2016"/>
+    <w:bookmarkEnd w:id="58"/>
+    <w:bookmarkStart w:id="60" w:name="ref-Sennrich2016"/>
     <w:p>
       <w:pPr>
         <w:pStyle w:val="Bibliography"/>
@@ -4155,7 +4167,7 @@
       <w:r>
         <w:t xml:space="preserve"> </w:t>
       </w:r>
-      <w:hyperlink r:id="rId57">
+      <w:hyperlink r:id="rId59">
         <w:r>
           <w:rPr>
             <w:rStyle w:val="Hyperlink"/>
@@ -4164,8 +4176,8 @@
         </w:r>
       </w:hyperlink>
     </w:p>
-    <w:bookmarkEnd w:id="58"/>
-    <w:bookmarkStart w:id="60" w:name="ref-Vaswani2017"/>
+    <w:bookmarkEnd w:id="60"/>
+    <w:bookmarkStart w:id="62" w:name="ref-Vaswani2017"/>
     <w:p>
       <w:pPr>
         <w:pStyle w:val="Bibliography"/>
@@ -4202,7 +4214,7 @@
       <w:r>
         <w:t xml:space="preserve"> </w:t>
       </w:r>
-      <w:hyperlink r:id="rId59">
+      <w:hyperlink r:id="rId61">
         <w:r>
           <w:rPr>
             <w:rStyle w:val="Hyperlink"/>
@@ -4211,8 +4223,8 @@
         </w:r>
       </w:hyperlink>
     </w:p>
-    <w:bookmarkEnd w:id="60"/>
-    <w:bookmarkStart w:id="62" w:name="ref-Weizenbaum1966"/>
+    <w:bookmarkEnd w:id="62"/>
+    <w:bookmarkStart w:id="64" w:name="ref-Weizenbaum1966"/>
     <w:p>
       <w:pPr>
         <w:pStyle w:val="Bibliography"/>
@@ -4249,7 +4261,7 @@
       <w:r>
         <w:t xml:space="preserve"> </w:t>
       </w:r>
-      <w:hyperlink r:id="rId61">
+      <w:hyperlink r:id="rId63">
         <w:r>
           <w:rPr>
             <w:rStyle w:val="Hyperlink"/>
@@ -4258,9 +4270,9 @@
         </w:r>
       </w:hyperlink>
     </w:p>
-    <w:bookmarkEnd w:id="62"/>
-    <w:bookmarkEnd w:id="63"/>
     <w:bookmarkEnd w:id="64"/>
+    <w:bookmarkEnd w:id="65"/>
+    <w:bookmarkEnd w:id="66"/>
     <w:sectPr>
       <w:footerReference r:id="rId9" w:type="default"/>
       <w:footnotePr>
@@ -4313,7 +4325,7 @@
       </w:r>
     </w:p>
   </w:footnote>
-  <w:footnote w:id="23">
+  <w:footnote w:id="22">
     <w:p>
       <w:pPr>
         <w:pStyle w:val="FootnoteText"/>
@@ -4328,6 +4340,48 @@
         <w:t xml:space="preserve"> </w:t>
       </w:r>
       <w:r>
+        <w:rPr>
+          <w:rStyle w:val="VerbatimChar"/>
+        </w:rPr>
+        <w:t xml:space="preserve">oracle.R</w:t>
+      </w:r>
+      <w:r>
+        <w:t xml:space="preserve"> </w:t>
+      </w:r>
+      <w:r>
+        <w:t xml:space="preserve">and further demonstrations are at</w:t>
+      </w:r>
+      <w:r>
+        <w:t xml:space="preserve"> </w:t>
+      </w:r>
+      <w:hyperlink r:id="rId23">
+        <w:r>
+          <w:rPr>
+            <w:rStyle w:val="Hyperlink"/>
+          </w:rPr>
+          <w:t xml:space="preserve">https://github.com/friendly/chatgpt-1759</w:t>
+        </w:r>
+      </w:hyperlink>
+      <w:r>
+        <w:t xml:space="preserve">.</w:t>
+      </w:r>
+    </w:p>
+  </w:footnote>
+  <w:footnote w:id="25">
+    <w:p>
+      <w:pPr>
+        <w:pStyle w:val="FootnoteText"/>
+      </w:pPr>
+      <w:r>
+        <w:rPr>
+          <w:rStyle w:val="FootnoteReference"/>
+        </w:rPr>
+        <w:footnoteRef/>
+      </w:r>
+      <w:r>
+        <w:t xml:space="preserve"> </w:t>
+      </w:r>
+      <w:r>
         <w:t xml:space="preserve">These are the two examples worked out in the pamphlet (pp. 48–55). The second question is spelled as Migneret prints it, with the eighteenth-century</w:t>
       </w:r>
       <w:r>
@@ -4384,7 +4438,7 @@
       </w:r>
     </w:p>
   </w:footnote>
-  <w:footnote w:id="24">
+  <w:footnote w:id="26">
     <w:p>
       <w:pPr>
         <w:pStyle w:val="FootnoteText"/>
@@ -4458,29 +4512,29 @@
       </w:r>
       <w:r>
         <w:t xml:space="preserve">. How to handle characters outside the expected vocabulary is a tokenization problem that modern LLMs still wrestle with. Migneret’s tables also use a “+” symbol as a skip placeholder: cells where a word needs fewer letters than the table has slots are simply passed over. The eighteenth-century padding token.</w:t>
-      </w:r>
-    </w:p>
-  </w:footnote>
-  <w:footnote w:id="34">
-    <w:p>
-      <w:pPr>
-        <w:pStyle w:val="FootnoteText"/>
-      </w:pPr>
-      <w:r>
-        <w:rPr>
-          <w:rStyle w:val="FootnoteReference"/>
-        </w:rPr>
-        <w:footnoteRef/>
-      </w:r>
-      <w:r>
-        <w:t xml:space="preserve"> </w:t>
-      </w:r>
-      <w:r>
-        <w:t xml:space="preserve">Somewhat deliciously, this summary of “debunking ChatGPT” was provided by Google’s AI Overview, with a bunch of references and videos.</w:t>
       </w:r>
     </w:p>
   </w:footnote>
   <w:footnote w:id="36">
+    <w:p>
+      <w:pPr>
+        <w:pStyle w:val="FootnoteText"/>
+      </w:pPr>
+      <w:r>
+        <w:rPr>
+          <w:rStyle w:val="FootnoteReference"/>
+        </w:rPr>
+        <w:footnoteRef/>
+      </w:r>
+      <w:r>
+        <w:t xml:space="preserve"> </w:t>
+      </w:r>
+      <w:r>
+        <w:t xml:space="preserve">Somewhat deliciously, this summary of “debunking ChatGPT” was provided by Google’s AI Overview, with a bunch of references and videos.</w:t>
+      </w:r>
+    </w:p>
+  </w:footnote>
+  <w:footnote w:id="38">
     <w:p>
       <w:pPr>
         <w:pStyle w:val="FootnoteText"/>

</xml_diff>

<commit_message>
Make the three short GitHub repository mentions real hyperlinks
Previously only the first mention (a footnote) carried the clickable
link; the other three just said "the GitHub repository" as plain text.
Turned those into markdown links too, so they render as real
hyperlinks in both the Word output and any future HTML version.
</commit_message>
<xml_diff>
--- a/chronique_bibliography.docx
+++ b/chronique_bibliography.docx
@@ -1342,7 +1342,21 @@
         <w:t xml:space="preserve"> </w:t>
       </w:r>
       <w:r>
-        <w:t xml:space="preserve">The right-hand edge of the triangle, read upward from its tip, begins with six digits, one for each word of the hexameter, each between 1 and 9. For our question they are 3, 9, 3, 6, 2, 3. Each is the number of a horizontal band, common to the two tables of Step 6 (Figure 3). Migneret dresses this up: he lays the triangle out in a grid of six lines and seven columns, then multiplies, adds and reduces modulo 9 once more to turn every other digit into a number between 11 and 72 (pp. 33–43), the numbers printed in the first table. Implementing the procedure in R shows that this changes nothing: the six indicators alone decide the verse (the program is in the GitHub repository).</w:t>
+        <w:t xml:space="preserve">The right-hand edge of the triangle, read upward from its tip, begins with six digits, one for each word of the hexameter, each between 1 and 9. For our question they are 3, 9, 3, 6, 2, 3. Each is the number of a horizontal band, common to the two tables of Step 6 (Figure 3). Migneret dresses this up: he lays the triangle out in a grid of six lines and seven columns, then multiplies, adds and reduces modulo 9 once more to turn every other digit into a number between 11 and 72 (pp. 33–43), the numbers printed in the first table. Implementing the procedure in R shows that this changes nothing: the six indicators alone decide the verse (the program is in</w:t>
+      </w:r>
+      <w:r>
+        <w:t xml:space="preserve"> </w:t>
+      </w:r>
+      <w:hyperlink r:id="rId23">
+        <w:r>
+          <w:rPr>
+            <w:rStyle w:val="Hyperlink"/>
+          </w:rPr>
+          <w:t xml:space="preserve">the GitHub repository</w:t>
+        </w:r>
+      </w:hyperlink>
+      <w:r>
+        <w:t xml:space="preserve">).</w:t>
       </w:r>
     </w:p>
     <w:p>
@@ -2994,7 +3008,21 @@
         <w:t xml:space="preserve"> </w:t>
       </w:r>
       <w:r>
-        <w:t xml:space="preserve">from the tables of the pamphlet (Migneret, 1759, plate between pp. 54 and 55); the full derivation is in the GitHub repository.</w:t>
+        <w:t xml:space="preserve">from the tables of the pamphlet (Migneret, 1759, plate between pp. 54 and 55); the full derivation is in</w:t>
+      </w:r>
+      <w:r>
+        <w:t xml:space="preserve"> </w:t>
+      </w:r>
+      <w:hyperlink r:id="rId23">
+        <w:r>
+          <w:rPr>
+            <w:rStyle w:val="Hyperlink"/>
+          </w:rPr>
+          <w:t xml:space="preserve">the GitHub repository</w:t>
+        </w:r>
+      </w:hyperlink>
+      <w:r>
+        <w:t xml:space="preserve">.</w:t>
       </w:r>
     </w:p>
     <w:p>
@@ -3639,7 +3667,21 @@
         <w:pStyle w:val="FirstParagraph"/>
       </w:pPr>
       <w:r>
-        <w:t xml:space="preserve">To be sure I had understood the pamphlet, I wanted to see if I could make Migneret’s machine actually run and produce his output from the Oracle. I did so with the help of an AI assistant (Claude Sonnet 5, from Anthropic, used through its Claude Code tool in September 2026), and it is worth saying how, because it is another angle on this topic. My AI assistant read the scan of the pamphlet and Migneret’s own instructions, and we turned them together into an R program (in the GitHub repository), tested against the worked examples he prints. In a slightly self-referential way, Claude served as my Oracle in this.</w:t>
+        <w:t xml:space="preserve">To be sure I had understood the pamphlet, I wanted to see if I could make Migneret’s machine actually run and produce his output from the Oracle. I did so with the help of an AI assistant (Claude Sonnet 5, from Anthropic, used through its Claude Code tool in September 2026), and it is worth saying how, because it is another angle on this topic. My AI assistant read the scan of the pamphlet and Migneret’s own instructions, and we turned them together into an R program (in</w:t>
+      </w:r>
+      <w:r>
+        <w:t xml:space="preserve"> </w:t>
+      </w:r>
+      <w:hyperlink r:id="rId23">
+        <w:r>
+          <w:rPr>
+            <w:rStyle w:val="Hyperlink"/>
+          </w:rPr>
+          <w:t xml:space="preserve">the GitHub repository</w:t>
+        </w:r>
+      </w:hyperlink>
+      <w:r>
+        <w:t xml:space="preserve">), tested against the worked examples he prints. In a slightly self-referential way, Claude served as my Oracle in this.</w:t>
       </w:r>
     </w:p>
     <w:p>

</xml_diff>